<commit_message>
fix(pizza-shop-en): revisión final aplicada (4 B · 6 M · 23 m) — G1-G9 VERDE, regresión 27/27
B1 tarjeta duplicada en el hub EN · B2 tarea de la beer & wine license · B3/M1 gas y VPN coherentes con la AVPN ·
B4 cuota de plataforma 12 % + guarda «10 % of sales» · M4/M5 textos ajustados a la calculadora · M6 extintores.
Detalle en business-plans-en-8/REVISION-FINAL.md §5.

Via: Claude Code

Co-Authored-By: Claude Opus 5.5 <noreply@anthropic.com>
</commit_message>
<xml_diff>
--- a/astro-site/public/dl/pizza-shop-business-plan/pizza-shop-business-plan.docx
+++ b/astro-site/public/dl/pizza-shop-business-plan/pizza-shop-business-plan.docx
@@ -315,12 +315,12 @@
     </w:p>
     <w:p>
       <w:r>
-        <w:t>This plan describes a Neapolitan-style pizza shop built around a wood-fired oven the guests can see, in a mid-sized American city of 150,000 to 300,000 people, on a neighborhood street with foot traffic or next to a plaza. The space is about 1,500 sq ft (139 sq m) with a flue to the roof, a dining room of 50 seats and a 24-seat patio from April to October, and it is leased as a second-generation space. It is run by a single-owner LLC: you as head pizzaiolo and general manager, a second pizzaiolo, a helper, front of house in two shifts and extra weekend help. It opens in September, Tuesday through Sunday, for lunch and dinner, and closes on Mondays and for two weeks in January. The menu is short and built on long-fermented dough.</w:t>
+        <w:t>This plan describes a Neapolitan-style pizza shop built around a wood-fired oven the guests can see, in a mid-sized American city of 150,000 to 300,000 people, on a neighborhood street with foot traffic. The space is about 1,500 sq ft (139 sq m) with a flue to the roof, a dining room of 50 seats and a 24-seat patio from April to October, and it is leased as a second-generation space. It is run by a single-owner LLC: you as head pizzaiolo and general manager, a second pizzaiolo, a helper, front of house in two shifts and extra weekend help. It opens in September, Tuesday through Sunday, for lunch and dinner, and closes on Mondays and for two weeks in January. The menu is short and built on long-fermented dough.</w:t>
       </w:r>
     </w:p>
     <w:p>
       <w:r>
-        <w:t>The key figures of the example case are these. We average 62 covers a day across the dining room, take-out and delivery, at an average check of $36.00 excluding sales tax, over 300 opening days. That produces $669,600 in year-1 revenue and a net profit of $39,275, or 5.9% of sales. The average includes the ramp-up: the Excel spreads the year month by month, and Month 1 is September. Accounting break-even is 55 covers a day, and cash break-even, which also covers the loan payments, is 53. That net margin is far below the 15-25% that some online templates promise; PMQ's 2026 Pizza Power Report quotes 2-3% for lean independents, so we would rather show you an honest number. It is not a guaranteed return but a starting point: change the assumptions and enter your own figures.</w:t>
+        <w:t>The key figures of the example case are these. We average 62 covers a day across the dining room, take-out and delivery, at an average check of $36.00 excluding sales tax, over 300 opening days. That produces $669,600 in year-1 revenue and a net profit of $39,275, or 5.9% of sales. The average includes the ramp-up: the Excel spreads the year month by month, and Month 1 is September. Accounting break-even is 55 covers a day, and cash break-even, which also covers the loan payments, is 53. That net margin is far below the 15-25% that some online templates promise; PMQ's 2026 Pizza Power Report quotes an independent operator at 2-3%, so we would rather show you an honest number. It is not a guaranteed return but a starting point: change the assumptions and enter your own figures.</w:t>
       </w:r>
     </w:p>
     <w:p>
@@ -377,7 +377,7 @@
     </w:p>
     <w:p>
       <w:r>
-        <w:t>Neapolitan-style vs VPN-certified: what you can put on your menu. In the United States we found no federal rule that restricts the word Neapolitan on a menu, and the European protection of the name Pizza Napoletana has no effect here, so you can write Neapolitan-style on your sign. VPN is different: the Associazione Verace Pizza Napoletana (AVPN) is a private, voluntary seal. Certification costs $2,500, plus $300 for the inspection and $400 a year to renew in the USA and Canada, and it asks for an open location (no food trucks), a wood-fired dome oven at about 900 °F (480 °C), and dough and ingredients that follow its rules. Gas or electric ovens do not qualify. The risk is saying VPN-certified without the certificate, which is misleading advertising. That is why the case menu says Margherita, Marinara and Diavola, with long-fermented dough and a wood-fired oven, and the shop calls itself Neapolitan-style.</w:t>
+        <w:t>Neapolitan-style vs VPN-certified: what you can put on your menu. In the United States we found no federal rule that restricts the word Neapolitan on a menu, and the European protection of the name Pizza Napoletana has no effect here, so you can write Neapolitan-style on your sign. VPN is different: the Associazione Verace Pizza Napoletana (AVPN) is a private, voluntary seal. Certification costs $2,500, plus $300 for the inspection and $400 a year to renew in the USA and Canada, and it asks for an open location (no food trucks), a wood-fired dome oven at about 900 °F (480 °C), and dough and ingredients that follow its rules. Electric, coal and wood/gas combination ovens do not qualify; a gas-fired dome oven is accepted only where wood burning is forbidden and you can document it (a city ordinance or a building rule). The risk is saying VPN-certified without the certificate, which is misleading advertising. That is why the case menu says Margherita, Marinara and Diavola, with long-fermented dough and a wood-fired oven, and the shop calls itself Neapolitan-style.</w:t>
       </w:r>
     </w:p>
     <w:p>
@@ -545,12 +545,12 @@
     </w:p>
     <w:p>
       <w:r>
-        <w:t>The dough is the heart of a Neapolitan-style pizza shop, so write its recipe in numbers, not adjectives. Work in grams and baker's percentages, the way the trade does: 00 flour at 100%, water, salt and fresh or dry yeast as a percentage of the flour, and a hydration you set after testing your own flour and oven. A common starting range for this style is about 60-65% hydration, with salt and yeast adjusted to your fermentation time. A same-day dough and a cold-fermented dough (a biga, a poolish or another preferment) behave differently, so pick one method, write it down and keep it. Mix, rest, then ball the dough by hand into 250 g (8.8 oz) dough balls, let them proof at room temperature or cold-ferment them in dough boxes, and use them within the window your written procedure sets. Stretch by hand, no rolling pin, to a pie of up to about 14 in (35 cm) with a thin center and a soft cornicione, and bake for 60-90 seconds at about 900 °F (480 °C) on the oven floor. If dough balls or cut toppings sit out of refrigeration, put time as a public health control (TPHC) in writing: the Food Code (3-501.19) allows up to 4 hours or up to 6 hours if you start at 41 °F or below and never go above 70 °F, with marked start and discard times. For raw dough itself, ask your health department how it classifies it. The calculator in this kit has two inputs: grams of ingredients and baker's percentages. It does not set your fermentation times; that is your recipe. Cost every pizza, not just the Margherita: fior di latte, mozzarella di bufala (DOP), burrata and imported cured meats push the food cost per pizza up fast.</w:t>
+        <w:t>The dough is the heart of a Neapolitan-style pizza shop, so write its recipe in numbers, not adjectives. Work in grams and baker's percentages, the way the trade does: 00 flour at 100%, water, salt and fresh or dry yeast as a percentage of the flour, and a hydration you set after testing your own flour and oven. A common starting range for this style is about 58-65% hydration (the traditional ratios in the calculator sit at 55-62%), with salt and yeast adjusted to your fermentation time. A same-day dough and a cold-fermented dough (a biga, a poolish or another preferment) behave differently, so pick one method, write it down and keep it. Mix, rest, then ball the dough by hand into 250 g (8.8 oz) dough balls, let them proof at room temperature or cold-ferment them in dough boxes, and use them within the window your written procedure sets. Stretch by hand, no rolling pin, to a pie of up to about 14 in (35 cm) with a thin center and a soft cornicione, and bake for 60-90 seconds at about 900 °F (480 °C) on the oven floor. If dough balls or cut toppings sit out of refrigeration, put time as a public health control (TPHC) in writing: the Food Code (3-501.19) allows up to 4 hours or up to 6 hours if you start at 41 °F or below and never go above 70 °F, with marked start and discard times. For raw dough itself, ask your health department how it classifies it. The calculator in this kit has two inputs: grams of ingredients and baker's percentages. It does not set your fermentation times; that is your recipe. Cost every pizza, not just the Margherita: fior di latte, mozzarella di bufala (DOP), burrata and imported cured meats push the food cost per pizza up fast.</w:t>
       </w:r>
     </w:p>
     <w:p>
       <w:r>
-        <w:t>The oven is the big decision, and you should make it before you sign the lease. The case uses a Neapolitan wood-fired dome oven, 47-51 in (120-130 cm), UL 2162-listed, for $22,000. Published prices vary a lot: Forno Bravo lists commercial models from $12,950, and many Italian and American makers (Marra Forni, for example) publish no price, so ask for a quote that includes installation and delivery. Add the flue, spark arrestor and insulated hearth pad, $12,000, and budget firewood as a fixed cost: $5,500 a year. You burn it by the hour the oven is lit, not by the pizza, and it must be dry, untreated hardwood (oak, ash, maple or olive). A gas oven needs a licensed gas contractor and its fuel use is fixed too, but be aware that gas and electric ovens do not meet the rules for VPN certification. Neither one automatically frees you from a hood or from a ventilation review: ask your fire marshal in writing.</w:t>
+        <w:t>The oven is the big decision, and you should make it before you sign the lease. The case uses a Neapolitan wood-fired dome oven, 47-51 in (120-130 cm), UL 2162-listed, for $22,000. Published prices vary a lot: Forno Bravo lists commercial models from $12,950, and many Italian and American makers (Marra Forni, for example) publish no price, so ask for a quote that includes installation and delivery. Add the flue, spark arrestor and insulated hearth pad, $12,000, and budget firewood as a fixed cost: $5,500 a year. You burn it by the hour the oven is lit, not by the pizza, and it must be dry, untreated hardwood (oak, ash, maple or fruitwood). A gas oven needs a licensed gas contractor and its fuel use is fixed too, but be aware that an electric oven never qualifies for VPN certification, and a gas oven only where wood burning is forbidden and documented. Neither one automatically frees you from a hood or from a ventilation review: ask your fire marshal in writing.</w:t>
       </w:r>
     </w:p>
     <w:p>
@@ -560,12 +560,12 @@
     </w:p>
     <w:p>
       <w:r>
-        <w:t>There is a reasoned alternative, outside the Excel: an electric oven instead of wood. You skip the wood-fired oven ($22,000), the flue and the spark arrestor ($12,000), and the firewood ($5,500 a year), and you pay instead for a high-power electric oven and a bigger electrical service. In exchange you cannot use the protected pizza name, and you may still need a hood and exhaust for the fumes. If your city does not allow wood smoke, this can be your way out; if it does, compare both budgets with real quotes before you decide.</w:t>
+        <w:t>There is a reasoned alternative, outside the Excel: an electric oven instead of wood. You skip the wood-fired oven ($22,000), the flue and the spark arrestor ($12,000), and the firewood ($5,500 a year), and you pay instead for a high-power electric oven and a bigger electrical service. In exchange you give up the VPN certification (the AVPN does not accept electric ovens), although you can still call your pizza Neapolitan-style, and you may still need a hood and exhaust for the fumes. If your city does not allow wood smoke, this can be your way out; if it does, compare both budgets with real quotes before you decide.</w:t>
       </w:r>
     </w:p>
     <w:p>
       <w:r>
-        <w:t>The case opens Tuesday through Sunday, with lunch from 11:30 a.m. to 3:00 p.m. and dinner from 5:00 to 10:00 p.m., and closes on Mondays, on Christmas Day and for two weeks in January. Food safety rests on your written HACCP-based food safety plan: log dough ball times and temperatures, hold mozzarella and cut tomatoes at 41 °F or below, and send food out in boxes that hold the temperature of what goes in them. Have the hood and flue cleaned on the schedule NFPA 96 and your fire marshal require, and budget for oven maintenance. Utilities average $1,800 a month: check the electrical and gas service of the space before you sign.</w:t>
+        <w:t>The case opens Tuesday through Sunday, with lunch from 11:30 a.m. to 3:00 p.m. and dinner from 5:00 to 10:00 p.m., and closes on Mondays, on the main holidays (Thanksgiving, Christmas, New Year's Day and July 4) and for two weeks in January. Food safety rests on your written HACCP-based food safety plan: log dough ball times and temperatures, hold mozzarella and cut tomatoes at 41 °F or below, and send food out in boxes that hold the temperature of what goes in them. Have the hood and flue cleaned on the schedule NFPA 96 and your fire marshal require, and budget for oven maintenance. Utilities average $1,800 a month: check the electrical and gas service of the space before you sign.</w:t>
       </w:r>
     </w:p>
     <w:p>
@@ -634,17 +634,17 @@
     </w:p>
     <w:p>
       <w:r>
-        <w:t>To open, you need $329,274 in cash. Startup costs without working capital come to $242,550: build-out, oven, equipment and launch, plus a security deposit, 2 months of rent paid before you open, and a contingency. Working capital adds $86,724. You fund it with $130,000 of your own money (39% of the cash needed) and a loan of $200,000 at 10.0% (nominal, not APR) over 10 years, a typical SBA 7(a) structure, with an annual payment of $32,549. Sales tax you pay on purchases is part of the cost; how you recover or deduct it depends on your state, so confirm it with your accountant.</w:t>
+        <w:t>To open, you need $329,274 in cash. Startup costs without working capital come to $242,550: build-out, oven, equipment and launch, plus a security deposit, 2 months of rent paid before you open, and a contingency. Working capital adds $86,724. You fund it with $130,000 of your own money (39% of the cash needed) and a loan of $200,000 at 10.0% (nominal, not APR) over 10 years, a typical SBA 7(a) structure, with an annual payment of $32,549. Sales tax you pay on purchases is part of the cost (the workbook recovers none); exemptions such as resale certificates depend on your state, so confirm them with your accountant.</w:t>
       </w:r>
     </w:p>
     <w:p>
       <w:r>
-        <w:t>The three-year profit and loss projects revenue, excluding sales tax, of $669,600, $709,776 and $738,167. Gross margin in year 1 is 63.5%, after all the variable costs: cost of goods (26.0% of sales), disposables, delivery marketplace fees, card processing and contingency. Labor adds up to $219,397, rent to $48,000 (7.2% of sales) and marketing to $6,000. EBITDA, earnings before depreciation, interest and taxes, is $98,299, or 14.7% of sales. Net profit is $39,275, $55,600 and $66,407; the net margin in year 1 is 5.9%, after an effective income tax rate of 25%. How your business is actually taxed depends on whether you run it as an LLC, an S corp or something else, so confirm that with your CPA. It is an honest figure: the 15-25% net margins that circulate online for pizza shops do not hold up with a fully staffed, legal team, and a 2026 report in PMQ Pizza Magazine quotes an independent operator at 2% to 3%.</w:t>
+        <w:t>The three-year profit and loss projects revenue, excluding sales tax, of $669,600, $709,776 and $738,167. Gross margin in year 1 is 63.5%, after all the variable costs: cost of goods (26.0% of sales), disposables, delivery marketplace fees, card processing and contingency. Labor adds up to $219,397, rent to $48,000 (7.2% of sales) and marketing to $6,000. EBITDA, earnings before depreciation, interest and taxes, is $98,299, or 14.7% of sales. Net profit is $39,275, $55,600 and $66,407; the net margin in year 1 is 5.9%, after an effective income tax rate of 25%. The example applies it as if the business paid corporate income tax (an LLC can elect it); as a pass-through, set the rate to 0 on "0. Assumptions" and budget your personal tax. How your business is actually taxed depends on whether you run it as an LLC, an S corp or something else, so confirm that with your CPA. It is an honest figure: the 15-25% net margins that circulate online for pizza shops do not hold up with a fully staffed, legal team, and a 2026 report in PMQ Pizza Magazine quotes an independent operator at 2% to 3%.</w:t>
       </w:r>
     </w:p>
     <w:p>
       <w:r>
-        <w:t>Growth is the one the Excel applies: covers rise 6% in year 2 and 4% in year 3, from 62 to 66 and 68 a day, with the same average check of $36.00 excluding sales tax, and staff grows by hiring people, not by a percentage. Sales are about 82% food and 18% beer and wine, with a cost of goods of 26% on food and 26% on beverages. The workbook uses one example sales tax rate of 8% and keeps it out of revenue: you collect it from guests and remit it to the state. Rates, and whether take-out is taxed differently from dine-in, vary by state and city, so check with your state revenue department.</w:t>
+        <w:t>Growth is the one the Excel applies: covers rise 6% in year 2 and 4% in year 3, from 62 to 66 and 68 a day, with the same average check of $36.00 excluding sales tax, and staff grows by hiring people, not by a percentage. Sales are about 82% food and 18% beverages (beer, wine, soft drinks and coffee), with a cost of goods of 26% on food and 26% on beverages. The workbook uses one example sales tax rate of 8% and keeps it out of revenue: you collect it from guests and remit it to the state. Rates, and whether take-out is taxed differently from dine-in, vary by state and city, so check with your state revenue department.</w:t>
       </w:r>
     </w:p>
     <w:p>
@@ -696,7 +696,7 @@
     </w:p>
     <w:p>
       <w:r>
-        <w:t>Before opening you need a health permit and a pre-opening inspection, after the plan review above. At least one person in charge should hold a Certified Food Protection Manager (CFPM) certificate (Food Code 2-102.12), and food handler cards depend on your state or county. Mozzarella, fior di latte, cured meats and cut tomatoes are TCS foods, so hold them at 41 °F or below, or at 135 °F or above if hot. If anything sits out, use a written TPHC procedure (Food Code 3-501.19): up to 4 hours, or up to 6 hours if you start at 41 °F or below and never go above 70 °F, with the hours marked. For the dough balls, the Food Code gives no specific rule; ask your regulator how they classify them, and build your HACCP-based food safety plan around the answer. A licensed gas contractor installs any gas line, and your city will inspect it.</w:t>
+        <w:t>Before opening you need a health permit and a pre-opening inspection, after the plan review above. At least one person in charge should hold a Certified Food Protection Manager (CFPM) certificate (Food Code 2-102.12), and food handler cards depend on your state or county. Fior di latte and other fresh mozzarella, cooked ham, raw sausage and cut tomatoes are TCS foods (some dry-cured meats are not: check the label), so hold them at 41 °F or below, or at 135 °F or above if hot. If anything sits out, use a written TPHC procedure (Food Code 3-501.19): up to 4 hours, or up to 6 hours if you start at 41 °F or below and never go above 70 °F, with the hours marked. For the dough balls, the Food Code gives no specific rule; ask your regulator how they classify them, and build your HACCP-based food safety plan around the answer. A licensed gas contractor installs any gas line, and your city will inspect it.</w:t>
       </w:r>
     </w:p>
     <w:p>
@@ -706,7 +706,7 @@
     </w:p>
     <w:p>
       <w:r>
-        <w:t>If you serve beer and wine, you need a license from your state's alcohol beverage control (ABC) agency plus local approval. In a state without a quota, the license is about $3,000 and sits inside the $14,000 project line; in a state with quotas it can cost much more, so ask your ABC. It often takes 3 to 12 months, so write a contingency into your lease: you should be able to walk away or pay reduced rent if the license is delayed. Your insurance, budgeted at $7,500 a year in the case, should combine general liability with liquor liability, property coverage that accounts for open flame, and workers' compensation. Train staff in responsible alcohol service. Playing recorded music in the dining room needs licenses from ASCAP, BMI and SESAC, and some cities have packaging ordinances for take-out containers, so ask the city before you order boxes.</w:t>
+        <w:t>If you serve beer and wine, you need a license from your state's alcohol beverage control (ABC) agency plus local approval. In a state without a quota, the case budgets about $3,000 for the license and sits inside the $14,000 project line; in a state with quotas it can cost much more, so ask your ABC. It often takes 3 to 12 months, so write a contingency into your lease: you should be able to walk away or pay reduced rent if the license is delayed. Your insurance, budgeted at $7,500 a year in the case, should combine general liability with liquor liability and property coverage that accounts for open flame; workers' compensation is budgeted in the payroll taxes. Train staff in responsible alcohol service. Playing recorded music in the dining room needs licenses from ASCAP, BMI and SESAC, and some cities have packaging ordinances for take-out containers, so ask the city before you order boxes.</w:t>
       </w:r>
     </w:p>
     <w:p>
@@ -743,7 +743,7 @@
     </w:p>
     <w:p>
       <w:r>
-        <w:t>The first risk, and the most expensive, is signing a lease for a space where the exhaust cannot reach the roof. Without a dedicated flue there is no wood-fired oven, and an electric one does not automatically free you from a hood either: ask the fire marshal in writing before you sign the lease. The second is calling your pizza "VPN-certified" without the AVPN certificate, which exposes you to taking it off the menu, the website and the marketplace listing. Say "Neapolitan-style" and name each pizza: Margherita, Marinara, Diavola. The third is costing only the Margherita: with mozzarella di bufala, burrata, imported cured meats and the marketplace commission, your best seller can run far above the plan's food cost. Cost every pizza on the menu with the calculator in this kit.</w:t>
+        <w:t>The first risk, and the most expensive, is signing a lease for a space where the exhaust cannot reach the roof. Without a dedicated flue there is no wood-fired oven, and an electric one does not automatically free you from a hood either: ask the fire marshal in writing before you sign the lease. The second is calling your pizza "VPN-certified" without the AVPN certificate, which exposes you to taking it off the menu, the website and the marketplace listing. Say "Neapolitan-style" and name each pizza: Margherita, Marinara, Diavola. The third is costing only the Margherita: with mozzarella di bufala, burrata or imported cured meats, your best seller can run far above the plan's food cost, and on marketplace orders the commission comes out of the price on top. Cost every pizza on the menu with the calculator in this kit.</w:t>
       </w:r>
     </w:p>
     <w:p>

</xml_diff>